<commit_message>
Simplify: two R scripts, Excel model, Word report and a short README
Co-Authored-By: Claude Opus 5.5 <noreply@anthropic.com>
</commit_message>
<xml_diff>
--- a/Project_Report.docx
+++ b/Project_Report.docx
@@ -414,17 +414,17 @@
               <w:pStyle w:val="Compact"/>
             </w:pPr>
             <w:r>
+              <w:t xml:space="preserve">Bayesian results</w:t>
+            </w:r>
+            <w:r>
+              <w:t xml:space="preserve"> </w:t>
+            </w:r>
+            <w:r>
               <w:rPr>
                 <w:b/>
                 <w:bCs/>
               </w:rPr>
-              <w:t xml:space="preserve">10 automated tests</w:t>
-            </w:r>
-            <w:r>
-              <w:t xml:space="preserve"> </w:t>
-            </w:r>
-            <w:r>
-              <w:t xml:space="preserve">(8 in R, 2 in Python), including one that reproduces the published NICE DSU TSD 2 example, run on every push</w:t>
+              <w:t xml:space="preserve">checked against the published NICE DSU TSD 2 worked example</w:t>
             </w:r>
           </w:p>
         </w:tc>
@@ -1356,7 +1356,7 @@
         <w:t xml:space="preserve"> </w:t>
       </w:r>
       <w:r>
-        <w:t xml:space="preserve">TSD 2 worked example; a test checks this on every run. All chains converged (Gelman–Rubin ≤ 1.002).</w:t>
+        <w:t xml:space="preserve">TSD 2 worked example. All chains converged (Gelman–Rubin ≤ 1.002).</w:t>
       </w:r>
     </w:p>
     <w:bookmarkEnd w:id="24"/>
@@ -1531,7 +1531,7 @@
         <w:rPr>
           <w:rStyle w:val="VerbatimChar"/>
         </w:rPr>
-        <w:t xml:space="preserve"># R 4.5 with JAGS installed (brew install jags, or conda install -c conda-forge jags r-rjags)</w:t>
+        <w:t xml:space="preserve">Rscript survival_analysis.R</w:t>
       </w:r>
       <w:r>
         <w:br/>
@@ -1540,52 +1540,7 @@
         <w:rPr>
           <w:rStyle w:val="VerbatimChar"/>
         </w:rPr>
-        <w:t xml:space="preserve">Rscript -e 'install.packages(c("survival","flexsurv","netmeta","gemtc","rjags","testthat","ggplot2"))'</w:t>
-      </w:r>
-      <w:r>
-        <w:br/>
-      </w:r>
-      <w:r>
-        <w:rPr>
-          <w:rStyle w:val="VerbatimChar"/>
-        </w:rPr>
-        <w:t xml:space="preserve">Rscript analysis/01_survival.R        # -&gt; outputs/, screenshots/01-03</w:t>
-      </w:r>
-      <w:r>
-        <w:br/>
-      </w:r>
-      <w:r>
-        <w:rPr>
-          <w:rStyle w:val="VerbatimChar"/>
-        </w:rPr>
-        <w:t xml:space="preserve">Rscript analysis/02_nma.R             # -&gt; outputs/, screenshots/04-06 (about 1 minute of MCMC)</w:t>
-      </w:r>
-      <w:r>
-        <w:br/>
-      </w:r>
-      <w:r>
-        <w:rPr>
-          <w:rStyle w:val="VerbatimChar"/>
-        </w:rPr>
-        <w:t xml:space="preserve">Rscript -e 'testthat::test_dir("tests/testthat")'</w:t>
-      </w:r>
-      <w:r>
-        <w:br/>
-      </w:r>
-      <w:r>
-        <w:rPr>
-          <w:rStyle w:val="VerbatimChar"/>
-        </w:rPr>
-        <w:t xml:space="preserve">pip install -r requirements.txt</w:t>
-      </w:r>
-      <w:r>
-        <w:br/>
-      </w:r>
-      <w:r>
-        <w:rPr>
-          <w:rStyle w:val="VerbatimChar"/>
-        </w:rPr>
-        <w:t xml:space="preserve">python excel/build_model.py           # -&gt; excel/survival_extrapolation_model.xlsx</w:t>
+        <w:t xml:space="preserve">Rscript network_meta_analysis.R</w:t>
       </w:r>
     </w:p>
     <w:bookmarkEnd w:id="28"/>
@@ -2079,34 +2034,13 @@
         <w:t xml:space="preserve">rjags</w:t>
       </w:r>
       <w:r>
-        <w:t xml:space="preserve">. Seeds fixed. Functions unit-tested with</w:t>
-      </w:r>
-      <w:r>
-        <w:t xml:space="preserve"> </w:t>
-      </w:r>
-      <w:r>
-        <w:rPr>
-          <w:rStyle w:val="VerbatimChar"/>
-        </w:rPr>
-        <w:t xml:space="preserve">testthat</w:t>
-      </w:r>
-      <w:r>
-        <w:t xml:space="preserve"> </w:t>
-      </w:r>
-      <w:r>
-        <w:t xml:space="preserve">against known values; tests run in GitHub Actions. All numbers in the README come from</w:t>
-      </w:r>
-      <w:r>
-        <w:t xml:space="preserve"> </w:t>
-      </w:r>
-      <w:r>
-        <w:rPr>
-          <w:rStyle w:val="VerbatimChar"/>
-        </w:rPr>
-        <w:t xml:space="preserve">outputs/</w:t>
-      </w:r>
-      <w:r>
-        <w:t xml:space="preserve">.</w:t>
+        <w:t xml:space="preserve">. Seeds fixed. Bayesian results checked against the</w:t>
+      </w:r>
+      <w:r>
+        <w:t xml:space="preserve"> </w:t>
+      </w:r>
+      <w:r>
+        <w:t xml:space="preserve">published NICE DSU TSD 2 example. All numbers in the report come from the scripts’ output.</w:t>
       </w:r>
     </w:p>
     <w:bookmarkEnd w:id="33"/>

</xml_diff>